<commit_message>
docs: checkpoint the v1.1 MoD deliverables and the customer clarification questions
Checkpoint before rebuilding SIMF-HLD-005 and SIMF-LLD-003 as v1.2 from the MoD
templates. Captures the uncommitted v1.1 edits (third-party integration wording)
and adds the seven clarification questions the customer sent.

Co-Authored-By: Claude Opus 5 (1M context) <noreply@anthropic.com>
</commit_message>
<xml_diff>
--- a/docs/SIMF-HLD-005-MoD-HLD-External-v1.1.docx
+++ b/docs/SIMF-HLD-005-MoD-HLD-External-v1.1.docx
@@ -1768,73 +1768,72 @@
                 <w:b/>
                 <w:sz w:val="24"/>
               </w:rPr>
-              <w:t xml:space="preserve">Internal applications: </w:t>
-            </w:r>
-            <w:r>
-              <w:rPr>
-                <w:sz w:val="24"/>
-              </w:rPr>
-              <w:t>SMTP e-mail relay, Syslog / SIEM, a filesystem file store, and SQL Server 2022 (Standard in Development / Test; Enterprise in an AlwaysOn Availability Group for production).</w:t>
-            </w:r>
-          </w:p>
-          <w:p>
-            <w:pPr>
-              <w:bidi w:val="0"/>
-              <w:spacing w:after="80"/>
-              <w:jc w:val="left"/>
-            </w:pPr>
-            <w:r>
-              <w:rPr>
-                <w:b/>
-                <w:sz w:val="24"/>
-              </w:rPr>
-              <w:t xml:space="preserve">External (outbound only, via the controlled egress point): </w:t>
-            </w:r>
-            <w:r>
-              <w:rPr>
-                <w:sz w:val="24"/>
-              </w:rPr>
-              <w:t>YouTube caption API, a server-to-server subtitle import that sends the public video id only. This is the sole outbound integration in the system. Artificial intelligence is not an external integration: no AI provider is enabled in the delivered configuration, so no AI request, session content or credential leaves the ministry network.</w:t>
-            </w:r>
-          </w:p>
-          <w:p>
-            <w:pPr>
-              <w:bidi w:val="0"/>
-              <w:spacing w:after="80"/>
-              <w:jc w:val="left"/>
-            </w:pPr>
-            <w:r>
-              <w:rPr>
-                <w:b/>
-                <w:sz w:val="24"/>
-              </w:rPr>
-              <w:t xml:space="preserve">Client-side: </w:t>
-            </w:r>
-            <w:r>
-              <w:rPr>
-                <w:sz w:val="24"/>
-              </w:rPr>
-              <w:t>YouTube live playback, performed by the attendee device; the platform stores only the stream URL.</w:t>
-            </w:r>
-          </w:p>
-          <w:p>
-            <w:pPr>
-              <w:bidi w:val="0"/>
-              <w:spacing w:after="80"/>
-              <w:jc w:val="left"/>
-            </w:pPr>
-            <w:r>
-              <w:rPr>
-                <w:b/>
-                <w:sz w:val="24"/>
-              </w:rPr>
-              <w:t xml:space="preserve">Not integrated: </w:t>
-            </w:r>
-            <w:r>
-              <w:rPr>
-                <w:sz w:val="24"/>
-              </w:rPr>
-              <w:t>Active Directory / LDAP. SIMF operates its own ASP.NET Core Identity store.</w:t>
+              <w:t>Internal applications: SMTP e-mail relay, Syslog / SIEM, a filesystem file store, and SQL Server 2022 (Standard in Development / Test; Enterprise in an AlwaysOn Availability Group for production).</w:t>
+              <w:br/>
+              <w:t>External (outbound only, via the controlled egress point): the video platform and the AI service. These are integration endpoints called over public URLs, not components of the solution, so they are shown in the data-flow view and not in the component view. The data each one receives is itemised in the third-party data statement under the data-flow figure.</w:t>
+              <w:br/>
+              <w:t>Client-side: YouTube live playback, performed by the attendee device; the platform stores only the stream URL.</w:t>
+              <w:br/>
+              <w:t>Not integrated: Active Directory / LDAP. SIMF operates its own ASP.NET Core Identity store.</w:t>
+            </w:r>
+            <w:r>
+              <w:rPr>
+                <w:sz w:val="24"/>
+              </w:rPr>
+            </w:r>
+          </w:p>
+          <w:p>
+            <w:pPr>
+              <w:bidi w:val="0"/>
+              <w:spacing w:after="80"/>
+              <w:jc w:val="left"/>
+            </w:pPr>
+            <w:r>
+              <w:rPr>
+                <w:b/>
+                <w:sz w:val="24"/>
+              </w:rPr>
+            </w:r>
+            <w:r>
+              <w:rPr>
+                <w:sz w:val="24"/>
+              </w:rPr>
+            </w:r>
+          </w:p>
+          <w:p>
+            <w:pPr>
+              <w:bidi w:val="0"/>
+              <w:spacing w:after="80"/>
+              <w:jc w:val="left"/>
+            </w:pPr>
+            <w:r>
+              <w:rPr>
+                <w:b/>
+                <w:sz w:val="24"/>
+              </w:rPr>
+            </w:r>
+            <w:r>
+              <w:rPr>
+                <w:sz w:val="24"/>
+              </w:rPr>
+            </w:r>
+          </w:p>
+          <w:p>
+            <w:pPr>
+              <w:bidi w:val="0"/>
+              <w:spacing w:after="80"/>
+              <w:jc w:val="left"/>
+            </w:pPr>
+            <w:r>
+              <w:rPr>
+                <w:b/>
+                <w:sz w:val="24"/>
+              </w:rPr>
+            </w:r>
+            <w:r>
+              <w:rPr>
+                <w:sz w:val="24"/>
+              </w:rPr>
             </w:r>
           </w:p>
         </w:tc>

</xml_diff>